<commit_message>
Add standalone script to check outlet coordinates in the sea
This script counts the number of outlet coordinates that fall in the sea,
verifying the output of the Silver layer's bounding box check. It enriches
the findings with master attributes and outputs the results to a CSV file
and a markdown file for forensics. The script does not modify any predictions
or pipeline processes, serving purely as an observational tool.
</commit_message>
<xml_diff>
--- a/report/DataX_round2_paper.docx
+++ b/report/DataX_round2_paper.docx
@@ -194,7 +194,7 @@
           <w:color w:val="1A202C"/>
           <w:sz w:val="22"/>
         </w:rPr>
-        <w:t xml:space="preserve"> for each of 20,000 outlets for January 2026 using a five-method statistical ensemble anchored on peer-conditional quantiles, validates the result against held-out January 2025, allocates a fixed LKR 5,000,000 trade-spend budget over 8,989 Western Province outlets through a concave water-filling optimiser, and surfaces every prediction with per-outlet feature attribution and an LLM-generated business narrative inside a Next.js web application.</w:t>
+        <w:t xml:space="preserve"> for each of 20,000 outlets for January 2026 using a five-method statistical ensemble anchored on peer-conditional quantiles, validates the result against held-out January 2025, allocates a fixed LKR 5,000,000 trade-spend budget over 8,588 Western Province outlets through a concave water-filling optimiser, and surfaces every prediction with per-outlet feature attribution and an LLM-generated business narrative inside a Next.js web application.</w:t>
       </w:r>
     </w:p>
     <w:p>
@@ -467,7 +467,7 @@
                 <w:color w:val="1A202C"/>
                 <w:sz w:val="21"/>
               </w:rPr>
-              <w:t>0.794 over 11,256 outlets</w:t>
+              <w:t>0.793 over 10,949 outlets</w:t>
             </w:r>
           </w:p>
         </w:tc>
@@ -509,7 +509,7 @@
                 <w:color w:val="1A202C"/>
                 <w:sz w:val="21"/>
               </w:rPr>
-              <w:t>4,999,955.90 across 8,803 funded outlets</w:t>
+              <w:t>4,999,912.87 across 8,416 funded outlets</w:t>
             </w:r>
           </w:p>
         </w:tc>
@@ -549,7 +549,7 @@
                 <w:color w:val="1A202C"/>
                 <w:sz w:val="21"/>
               </w:rPr>
-              <w:t>35% / 42% / 23%</w:t>
+              <w:t>34.9% / 41.8% / 23.3%</w:t>
             </w:r>
           </w:p>
         </w:tc>
@@ -591,7 +591,7 @@
                 <w:color w:val="1A202C"/>
                 <w:sz w:val="21"/>
               </w:rPr>
-              <w:t>LKR 33,629,125 (net 28.6M of 5M capex)</w:t>
+              <w:t>LKR 36,650,325 (net 31.65M of 5M capex)</w:t>
             </w:r>
           </w:p>
         </w:tc>
@@ -631,7 +631,7 @@
                 <w:color w:val="1A202C"/>
                 <w:sz w:val="21"/>
               </w:rPr>
-              <w:t>0.879 ± 0.006</w:t>
+              <w:t>0.879 ± 0.004</w:t>
             </w:r>
           </w:p>
         </w:tc>
@@ -673,7 +673,7 @@
                 <w:color w:val="1A202C"/>
                 <w:sz w:val="21"/>
               </w:rPr>
-              <w:t>96</w:t>
+              <w:t>91</w:t>
             </w:r>
           </w:p>
         </w:tc>
@@ -3213,7 +3213,7 @@
                 <w:color w:val="1A202C"/>
                 <w:sz w:val="21"/>
               </w:rPr>
-              <w:t>979</w:t>
+              <w:t>985</w:t>
             </w:r>
           </w:p>
         </w:tc>
@@ -3838,7 +3838,7 @@
                 <w:color w:val="1A202C"/>
                 <w:sz w:val="21"/>
               </w:rPr>
-              <w:t>82,810</w:t>
+              <w:t>80,611</w:t>
             </w:r>
           </w:p>
         </w:tc>
@@ -3898,7 +3898,7 @@
                 <w:color w:val="1A202C"/>
                 <w:sz w:val="21"/>
               </w:rPr>
-              <w:t>2,783</w:t>
+              <w:t>2,707</w:t>
             </w:r>
           </w:p>
         </w:tc>
@@ -3918,6 +3918,68 @@
                 <w:sz w:val="21"/>
               </w:rPr>
               <w:t>flagged — used as positive training labels for the dormancy classifier</w:t>
+            </w:r>
+          </w:p>
+        </w:tc>
+      </w:tr>
+      <w:tr>
+        <w:tc>
+          <w:tcPr>
+            <w:tcW w:type="dxa" w:w="3213"/>
+            <w:shd w:val="clear" w:color="auto" w:fill="F4F6F9"/>
+            <w:vAlign w:val="center"/>
+          </w:tcPr>
+          <w:p>
+            <w:r/>
+            <w:r>
+              <w:rPr>
+                <w:rFonts w:ascii="Calibri" w:hAnsi="Calibri"/>
+                <w:b w:val="0"/>
+                <w:i w:val="0"/>
+                <w:color w:val="1A202C"/>
+                <w:sz w:val="21"/>
+              </w:rPr>
+              <w:t>Coordinates outside coarse land-mask (≥ 5 km from any land outlet)</w:t>
+            </w:r>
+          </w:p>
+        </w:tc>
+        <w:tc>
+          <w:tcPr>
+            <w:tcW w:type="dxa" w:w="3213"/>
+            <w:shd w:val="clear" w:color="auto" w:fill="F4F6F9"/>
+            <w:vAlign w:val="center"/>
+          </w:tcPr>
+          <w:p>
+            <w:r/>
+            <w:r>
+              <w:rPr>
+                <w:rFonts w:ascii="Calibri" w:hAnsi="Calibri"/>
+                <w:b w:val="0"/>
+                <w:i w:val="0"/>
+                <w:color w:val="1A202C"/>
+                <w:sz w:val="21"/>
+              </w:rPr>
+              <w:t>521</w:t>
+            </w:r>
+          </w:p>
+        </w:tc>
+        <w:tc>
+          <w:tcPr>
+            <w:tcW w:type="dxa" w:w="3213"/>
+            <w:shd w:val="clear" w:color="auto" w:fill="F4F6F9"/>
+            <w:vAlign w:val="center"/>
+          </w:tcPr>
+          <w:p>
+            <w:r/>
+            <w:r>
+              <w:rPr>
+                <w:rFonts w:ascii="Calibri" w:hAnsi="Calibri"/>
+                <w:b w:val="0"/>
+                <w:i w:val="0"/>
+                <w:color w:val="1A202C"/>
+                <w:sz w:val="21"/>
+              </w:rPr>
+              <w:t>quarantined — likely GPS errors; coastal coordinates kept within 5 km buffer</w:t>
             </w:r>
           </w:p>
         </w:tc>
@@ -5396,7 +5458,7 @@
           <w:color w:val="1A202C"/>
           <w:sz w:val="22"/>
         </w:rPr>
-        <w:t>0.794</w:t>
+        <w:t>0.793</w:t>
       </w:r>
       <w:r>
         <w:rPr>
@@ -5406,7 +5468,7 @@
           <w:color w:val="1A202C"/>
           <w:sz w:val="22"/>
         </w:rPr>
-        <w:t xml:space="preserve"> over 11,256 outlets. The MAE and median % error are also reported in the audit CSV.</w:t>
+        <w:t xml:space="preserve"> over 10,949 outlets. The MAE and median % error are also reported in the audit CSV.</w:t>
       </w:r>
     </w:p>
     <w:p>
@@ -5542,7 +5604,7 @@
           <w:color w:val="1A202C"/>
           <w:sz w:val="22"/>
         </w:rPr>
-        <w:t xml:space="preserve"> (Western Province only, 8,989 outlets) and </w:t>
+        <w:t xml:space="preserve"> (Western Province only, 8,588 outlets after sea-coordinate quarantine) and </w:t>
       </w:r>
       <w:r>
         <w:rPr>
@@ -5834,7 +5896,7 @@
           <w:color w:val="1A202C"/>
           <w:sz w:val="22"/>
         </w:rPr>
-        <w:t>4,999,955.90</w:t>
+        <w:t>4,999,912.87</w:t>
       </w:r>
       <w:r>
         <w:rPr>
@@ -5854,7 +5916,7 @@
           <w:color w:val="1A202C"/>
           <w:sz w:val="22"/>
         </w:rPr>
-        <w:t>8,803 of 8,989</w:t>
+        <w:t>8,416 of 8,588</w:t>
       </w:r>
       <w:r>
         <w:rPr>
@@ -5864,7 +5926,7 @@
           <w:color w:val="1A202C"/>
           <w:sz w:val="22"/>
         </w:rPr>
-        <w:t xml:space="preserve"> outlets; 186 outlets with zero uplift receive zero allocation. No outlet hits the 5,000 LKR cap. The 24-month sensitivity sweep at six elasticity values is published to </w:t>
+        <w:t xml:space="preserve"> outlets; 172 outlets with zero uplift receive zero allocation. No outlet hits the 5,000 LKR cap. The 24-month sensitivity sweep at six elasticity values is published to </w:t>
       </w:r>
       <w:r>
         <w:rPr>
@@ -6049,7 +6111,7 @@
                 <w:color w:val="1A202C"/>
                 <w:sz w:val="21"/>
               </w:rPr>
-              <w:t>1,740,292</w:t>
+              <w:t>1,744,750</w:t>
             </w:r>
           </w:p>
         </w:tc>
@@ -6068,7 +6130,7 @@
                 <w:color w:val="1A202C"/>
                 <w:sz w:val="21"/>
               </w:rPr>
-              <w:t>35 %</w:t>
+              <w:t>34.9 %</w:t>
             </w:r>
           </w:p>
         </w:tc>
@@ -6110,7 +6172,7 @@
                 <w:color w:val="1A202C"/>
                 <w:sz w:val="21"/>
               </w:rPr>
-              <w:t>2,097,036</w:t>
+              <w:t>2,089,088</w:t>
             </w:r>
           </w:p>
         </w:tc>
@@ -6130,7 +6192,7 @@
                 <w:color w:val="1A202C"/>
                 <w:sz w:val="21"/>
               </w:rPr>
-              <w:t>42 %</w:t>
+              <w:t>41.8 %</w:t>
             </w:r>
           </w:p>
         </w:tc>
@@ -6170,7 +6232,7 @@
                 <w:color w:val="1A202C"/>
                 <w:sz w:val="21"/>
               </w:rPr>
-              <w:t>1,162,628</w:t>
+              <w:t>1,166,075</w:t>
             </w:r>
           </w:p>
         </w:tc>
@@ -6189,7 +6251,7 @@
                 <w:color w:val="1A202C"/>
                 <w:sz w:val="21"/>
               </w:rPr>
-              <w:t>23 %</w:t>
+              <w:t>23.3 %</w:t>
             </w:r>
           </w:p>
         </w:tc>
@@ -6231,7 +6293,7 @@
                 <w:color w:val="1A202C"/>
                 <w:sz w:val="21"/>
               </w:rPr>
-              <w:t>5,000,000</w:t>
+              <w:t>4,999,913</w:t>
             </w:r>
           </w:p>
         </w:tc>
@@ -6374,7 +6436,7 @@
           <w:color w:val="1A202C"/>
           <w:sz w:val="22"/>
         </w:rPr>
-        <w:t xml:space="preserve"> (Top-100 by 24-month NPV, total LKR 28.6 M net of LKR 5 M capex at 3.6-month median payback), </w:t>
+        <w:t xml:space="preserve"> (Top-100 by 24-month NPV, total LKR 31.65 M net of LKR 5 M capex at 3.33-month median payback), </w:t>
       </w:r>
       <w:r>
         <w:rPr>
@@ -6414,7 +6476,7 @@
           <w:color w:val="1A202C"/>
           <w:sz w:val="22"/>
         </w:rPr>
-        <w:t xml:space="preserve"> (XGBoost classifier on the 2,783 historical lapse cases, 5-fold CV AUC 0.879), </w:t>
+        <w:t xml:space="preserve"> (XGBoost classifier on the 2,707 historical lapse cases, 5-fold CV AUC 0.879), </w:t>
       </w:r>
       <w:r>
         <w:rPr>
@@ -6454,7 +6516,7 @@
           <w:color w:val="1A202C"/>
           <w:sz w:val="22"/>
         </w:rPr>
-        <w:t xml:space="preserve"> (96 sub-province clusters for route planning).</w:t>
+        <w:t xml:space="preserve"> (91 sub-province clusters for route planning).</w:t>
       </w:r>
     </w:p>
     <w:p>
@@ -7054,7 +7116,7 @@
           <w:color w:val="1A202C"/>
           <w:sz w:val="22"/>
         </w:rPr>
-        <w:t>: an initial counter over-reported corrections (5,958 vs the true 979) because it counted rows whose value happened to match a canonical entry even when no change occurred. Fixed before any narrative was written.</w:t>
+        <w:t>: an initial counter over-reported corrections (5,958 vs the true 985) because it counted rows whose value happened to match a canonical entry even when no change occurred. Fixed before any narrative was written.</w:t>
       </w:r>
     </w:p>
     <w:p>
@@ -7436,7 +7498,7 @@
           <w:color w:val="1A202C"/>
           <w:sz w:val="22"/>
         </w:rPr>
-        <w:t xml:space="preserve"> with leaf cluster selection and added a "reassign noise to nearest centroid" step, yielding 96 useful sub-province territories.</w:t>
+        <w:t xml:space="preserve"> with leaf cluster selection and added a "reassign noise to nearest centroid" step, yielding 91 useful sub-province territories.</w:t>
       </w:r>
     </w:p>
     <w:p>
@@ -7852,7 +7914,7 @@
           <w:color w:val="1A202C"/>
           <w:sz w:val="22"/>
         </w:rPr>
-        <w:t xml:space="preserve"> Produced the Top-100 list (LKR 28.6 M net 24-month value) that anchors the pitch deck. 5. </w:t>
+        <w:t xml:space="preserve"> Produced the Top-100 list (LKR 31.65 M net 24-month value) that anchors the pitch deck. 5. </w:t>
       </w:r>
       <w:r>
         <w:rPr>
@@ -7923,7 +7985,7 @@
           <w:color w:val="1A202C"/>
           <w:sz w:val="22"/>
         </w:rPr>
-        <w:t>The β elasticity in the budget LP is uncalibrated — we publish a sensitivity sweep rather than a single number.</w:t>
+        <w:t>β elasticity in the budget LP is uncalibrated — sensitivity sweep published instead of a single number.</w:t>
       </w:r>
     </w:p>
     <w:p>
@@ -7939,7 +8001,7 @@
           <w:color w:val="1A202C"/>
           <w:sz w:val="22"/>
         </w:rPr>
-        <w:t>Counterfactuals are model-predicted, not empirically validated against historical cooler installations (the dataset records no installation dates).</w:t>
+        <w:t>Counterfactuals are model-predicted, not empirically validated (no install-date records in the dataset).</w:t>
       </w:r>
     </w:p>
     <w:p>
@@ -7955,7 +8017,7 @@
           <w:color w:val="1A202C"/>
           <w:sz w:val="22"/>
         </w:rPr>
-        <w:t xml:space="preserve">The cooler replenishment cycle is modelled through its </w:t>
+        <w:t xml:space="preserve">Cooler replenishment cycle modelled via its </w:t>
       </w:r>
       <w:r>
         <w:rPr>
@@ -7985,7 +8047,7 @@
           <w:color w:val="1A202C"/>
           <w:sz w:val="21"/>
         </w:rPr>
-        <w:t>replenishment_friction = stockout_flag_sum / active_months</w:t>
+        <w:t>stockout_flag_sum / active_months</w:t>
       </w:r>
       <w:r>
         <w:rPr>
@@ -7995,7 +8057,7 @@
           <w:color w:val="1A202C"/>
           <w:sz w:val="22"/>
         </w:rPr>
-        <w:t>) rather than the underlying delivery-cycle process itself.</w:t>
+        <w:t>), not the delivery process.</w:t>
       </w:r>
     </w:p>
     <w:p>
@@ -8011,7 +8073,7 @@
           <w:color w:val="1A202C"/>
           <w:sz w:val="22"/>
         </w:rPr>
-        <w:t>Channel split heuristics are informed by marketing-mix-modelling conventions, not fitted from data.</w:t>
+        <w:t>Channel split heuristics from MMM conventions, not data-fitted.</w:t>
       </w:r>
     </w:p>
     <w:p>
@@ -8027,87 +8089,7 @@
           <w:color w:val="1A202C"/>
           <w:sz w:val="22"/>
         </w:rPr>
-        <w:t>OSM POI coverage is patchier in rural districts than in Colombo; the within-province POI tier normalisation mitigates this but does not eliminate it.</w:t>
-      </w:r>
-    </w:p>
-    <w:p>
-      <w:pPr>
-        <w:pBdr>
-          <w:bottom w:val="single" w:sz="6" w:space="1" w:color="B8C2CC"/>
-        </w:pBdr>
-      </w:pPr>
-    </w:p>
-    <w:p>
-      <w:pPr>
-        <w:spacing w:before="280" w:after="80"/>
-        <w:pBdr>
-          <w:bottom w:val="single" w:sz="8" w:space="2" w:color="0E7CBE"/>
-        </w:pBdr>
-      </w:pPr>
-      <w:r>
-        <w:rPr>
-          <w:rFonts w:ascii="Calibri" w:hAnsi="Calibri"/>
-          <w:b/>
-          <w:i w:val="0"/>
-          <w:color w:val="0E3F6E"/>
-          <w:sz w:val="30"/>
-        </w:rPr>
-        <w:t>Closing</w:t>
-      </w:r>
-    </w:p>
-    <w:p>
-      <w:pPr>
-        <w:spacing w:after="120" w:line="300" w:lineRule="auto"/>
-      </w:pPr>
-      <w:r>
-        <w:rPr>
-          <w:rFonts w:ascii="Calibri" w:hAnsi="Calibri"/>
-          <w:b w:val="0"/>
-          <w:i w:val="0"/>
-          <w:color w:val="1A202C"/>
-          <w:sz w:val="22"/>
-        </w:rPr>
-        <w:t xml:space="preserve">The submission delivers six artifacts: the predictions CSV, the LKR 5M Western Province budget allocation CSV, the reproducible 12-phase pipeline, the Outlet Intelligence web app with on-demand Gemini-grounded explanations, this methodology paper, and the executive pitch deck. Every numeric claim above is cross-referenced in </w:t>
-      </w:r>
-      <w:r>
-        <w:rPr>
-          <w:rFonts w:ascii="Consolas" w:hAnsi="Consolas"/>
-          <w:b w:val="0"/>
-          <w:i w:val="0"/>
-          <w:color w:val="1A202C"/>
-          <w:sz w:val="21"/>
-        </w:rPr>
-        <w:t>outputs/audit/</w:t>
-      </w:r>
-      <w:r>
-        <w:rPr>
-          <w:rFonts w:ascii="Calibri" w:hAnsi="Calibri"/>
-          <w:b w:val="0"/>
-          <w:i w:val="0"/>
-          <w:color w:val="1A202C"/>
-          <w:sz w:val="22"/>
-        </w:rPr>
-        <w:t xml:space="preserve"> or the README key-numbers block, and the methodology overview in </w:t>
-      </w:r>
-      <w:r>
-        <w:rPr>
-          <w:rFonts w:ascii="Consolas" w:hAnsi="Consolas"/>
-          <w:b w:val="0"/>
-          <w:i w:val="0"/>
-          <w:color w:val="1A202C"/>
-          <w:sz w:val="21"/>
-        </w:rPr>
-        <w:t>docs/methodology_overview.md</w:t>
-      </w:r>
-      <w:r>
-        <w:rPr>
-          <w:rFonts w:ascii="Calibri" w:hAnsi="Calibri"/>
-          <w:b w:val="0"/>
-          <w:i w:val="0"/>
-          <w:color w:val="1A202C"/>
-          <w:sz w:val="22"/>
-        </w:rPr>
-        <w:t xml:space="preserve"> provides the full per-module reference with 25 diagrams.</w:t>
+        <w:t>OSM POI coverage is patchier in rural districts; within-province tier normalisation mitigates this.</w:t>
       </w:r>
     </w:p>
     <w:p>

</xml_diff>